<commit_message>
Folha de rosto: afiliação ao Gothenburg Global Biodiversity Centre
Co-Authored-By: Claude Opus 5.5 <noreply@anthropic.com>
</commit_message>
<xml_diff>
--- a/manuscript/title_page.docx
+++ b/manuscript/title_page.docx
@@ -21,7 +21,7 @@
         <w:rPr>
           <w:vertAlign w:val="superscript"/>
         </w:rPr>
-        <w:t xml:space="preserve">1</w:t>
+        <w:t xml:space="preserve">1,2</w:t>
       </w:r>
     </w:p>
     <w:p>
@@ -39,6 +39,23 @@
       </w:r>
       <w:r>
         <w:t xml:space="preserve">Instituto de Biociências, Universidade Federal de Mato Grosso do Sul, Campo Grande, Mato Grosso do Sul, Brazil</w:t>
+      </w:r>
+    </w:p>
+    <w:p>
+      <w:pPr>
+        <w:pStyle w:val="BodyText"/>
+      </w:pPr>
+      <w:r>
+        <w:rPr>
+          <w:vertAlign w:val="superscript"/>
+        </w:rPr>
+        <w:t xml:space="preserve">2</w:t>
+      </w:r>
+      <w:r>
+        <w:t xml:space="preserve"> </w:t>
+      </w:r>
+      <w:r>
+        <w:t xml:space="preserve">Gothenburg Global Biodiversity Centre, University of Gothenburg, Gothenburg, Sweden</w:t>
       </w:r>
     </w:p>
     <w:p>

</xml_diff>